<commit_message>
Update production guide: 10-15 min runtime + credit-cost guidance
Set target runtime to 10-15 minutes (default ~12), update word-count and
shot-count math accordingly, add a credit-cost management section (key-frame
+ edit approach) and a high-volume note on using an unlimited image model
for the bulk of stills while reserving Nano Banana Pro for hero frames.

https://claude.ai/code/session_012yrhJkQFRZkiQjmevywnos
</commit_message>
<xml_diff>
--- a/PRODUCTION_GUIDE.docx
+++ b/PRODUCTION_GUIDE.docx
@@ -543,7 +543,7 @@
         <w:rPr>
           <w:sz w:val="21"/>
         </w:rPr>
-        <w:t>Target runtime: 4–7 minutes (default ~5). State the chosen target in the header.</w:t>
+        <w:t>Target runtime: 10–15 minutes (default ~12). State the chosen target in the header.</w:t>
       </w:r>
     </w:p>
     <w:p>
@@ -565,7 +565,7 @@
         <w:rPr>
           <w:sz w:val="21"/>
         </w:rPr>
-        <w:t>At 150 wpm, a 5-minute episode ≈ 750 words.</w:t>
+        <w:t>At 150 wpm: a 10-minute episode ≈ 1,500 words, 12 min ≈ 1,800 words, 15 min ≈ 2,250 words.</w:t>
       </w:r>
     </w:p>
     <w:p>
@@ -663,7 +663,7 @@
                 <w:color w:val="8A4B16"/>
                 <w:sz w:val="20"/>
               </w:rPr>
-              <w:t>RESULT: a 5-minute (~750-word) episode produces roughly 75–100 shots — i.e., 75–100 images in the folder. Plan generation accordingly.</w:t>
+              <w:t>RESULT: a 10–15 minute episode produces roughly 150–300 shots — i.e., 150–300 on-screen visuals (more if the pace is fast). Plan generation time and Higgsfield credits accordingly (see Part 8e for how to hit this cadence WITHOUT generating a separate image for every shot).</w:t>
             </w:r>
           </w:p>
         </w:tc>
@@ -2519,6 +2519,17 @@
     </w:p>
     <w:p>
       <w:pPr>
+        <w:pStyle w:val="ListBullet"/>
+      </w:pPr>
+      <w:r>
+        <w:rPr>
+          <w:sz w:val="21"/>
+        </w:rPr>
+        <w:t>HIGH-VOLUME / DAILY OUTPUT: Nano Banana Pro costs credits (~2 each), which is expensive at a daily cadence. For the BULK of stills, use a model in your plan’s 365-day UNLIMITED set (e.g., Seedream 4.5) so you do not burn credits, and reserve Nano Banana Pro credits for hero frames and any text/diagram frames. Confirm the chosen model reproduces the series style before committing to it.</w:t>
+      </w:r>
+    </w:p>
+    <w:p>
+      <w:pPr>
         <w:pStyle w:val="Heading2"/>
       </w:pPr>
       <w:r>
@@ -2681,6 +2692,67 @@
       </w:tr>
     </w:tbl>
     <w:p/>
+    <w:p>
+      <w:pPr>
+        <w:pStyle w:val="Heading2"/>
+      </w:pPr>
+      <w:r>
+        <w:t>8e. Managing Credit Cost (important at 10–15 minutes)</w:t>
+      </w:r>
+    </w:p>
+    <w:p>
+      <w:r>
+        <w:rPr>
+          <w:i w:val="0"/>
+          <w:sz w:val="21"/>
+        </w:rPr>
+        <w:t>A 10–15 minute episode with a visual change every 3–5 seconds implies 150–300 on-screen visuals. Generating a brand-new image for every one is the most credit-expensive path. To keep the pacing but control cost:</w:t>
+      </w:r>
+    </w:p>
+    <w:p>
+      <w:pPr>
+        <w:pStyle w:val="ListBullet"/>
+      </w:pPr>
+      <w:r>
+        <w:rPr>
+          <w:sz w:val="21"/>
+        </w:rPr>
+        <w:t>Generate KEY frames — one strong still per beat / shot family (typically 60–120 per episode) — and create the in-between 3–5s visual changes in your video EDITOR via slow pan/zoom (Ken Burns), reveals, and simple element motion on the same still. The on-screen visual still changes every 3–5s, but you generate far fewer images.</w:t>
+      </w:r>
+    </w:p>
+    <w:p>
+      <w:pPr>
+        <w:pStyle w:val="ListBullet"/>
+      </w:pPr>
+      <w:r>
+        <w:rPr>
+          <w:sz w:val="21"/>
+        </w:rPr>
+        <w:t>Reuse the Host Element and recurring backgrounds across shots and across episodes.</w:t>
+      </w:r>
+    </w:p>
+    <w:p>
+      <w:pPr>
+        <w:pStyle w:val="ListBullet"/>
+      </w:pPr>
+      <w:r>
+        <w:rPr>
+          <w:sz w:val="21"/>
+        </w:rPr>
+        <w:t>Reserve true CLIPs and re-generations for where they truly matter — they cost the most.</w:t>
+      </w:r>
+    </w:p>
+    <w:p>
+      <w:pPr>
+        <w:pStyle w:val="ListBullet"/>
+      </w:pPr>
+      <w:r>
+        <w:rPr>
+          <w:sz w:val="21"/>
+        </w:rPr>
+        <w:t>Cost guide (Nano Banana Pro ≈ 2 credits/image): generating EVERY frame ≈ 300–600 credits/episode; the key-frame + edit approach ≈ 120–240 credits/episode.</w:t>
+      </w:r>
+    </w:p>
     <w:p>
       <w:pPr>
         <w:pStyle w:val="Heading1"/>

</xml_diff>

<commit_message>
Prioritize Seedream 4.5 as the primary image model in the guide
Make Seedream 4.5 the series default (1 credit/image, up to 4K, in the
365-day unlimited set); demote Nano Banana Pro to a secondary model for
text/diagram frames only. Add cost note on web-app unlimited vs API credit
billing and free-tier limits. Update cost guide and procedure accordingly.

https://claude.ai/code/session_012yrhJkQFRZkiQjmevywnos
</commit_message>
<xml_diff>
--- a/PRODUCTION_GUIDE.docx
+++ b/PRODUCTION_GUIDE.docx
@@ -2492,7 +2492,7 @@
         <w:rPr>
           <w:sz w:val="21"/>
         </w:rPr>
-        <w:t>Use Higgsfield’s BEST current image model — Nano Banana Pro (model id: nano_banana_pro). If unsure it is still the top model, run models_explore first and pick the highest-quality image model available.</w:t>
+        <w:t>PRIMARY model — Seedream 4.5 (model id: seedream_v4_5). This is the DEFAULT for every image in the series: high quality, up to 4K, ~1 credit each (half the cost of Nano Banana Pro), and included in the paid plans’ 365-day UNLIMITED set. Use quality 'high' for hero frames, 'basic' for the rest.</w:t>
       </w:r>
     </w:p>
     <w:p>
@@ -2503,7 +2503,7 @@
         <w:rPr>
           <w:sz w:val="21"/>
         </w:rPr>
-        <w:t>aspect_ratio: 16:9. Highest resolution offered. Generate one image per shot (use count to batch a scene).</w:t>
+        <w:t>SECONDARY model — Nano Banana Pro (nano_banana_pro) or GPT Image, used ONLY for frames that contain on-image text or diagrams (stronger text rendering). These cost more credits, so use them sparingly.</w:t>
       </w:r>
     </w:p>
     <w:p>
@@ -2514,7 +2514,7 @@
         <w:rPr>
           <w:sz w:val="21"/>
         </w:rPr>
-        <w:t>For motion shots, generate the STILL first, then animate it with image-to-video so the style is preserved.</w:t>
+        <w:t>aspect_ratio: 16:9 for every image. Generate one image per shot (use count to batch a scene).</w:t>
       </w:r>
     </w:p>
     <w:p>
@@ -2525,7 +2525,18 @@
         <w:rPr>
           <w:sz w:val="21"/>
         </w:rPr>
-        <w:t>HIGH-VOLUME / DAILY OUTPUT: Nano Banana Pro costs credits (~2 each), which is expensive at a daily cadence. For the BULK of stills, use a model in your plan’s 365-day UNLIMITED set (e.g., Seedream 4.5) so you do not burn credits, and reserve Nano Banana Pro credits for hero frames and any text/diagram frames. Confirm the chosen model reproduces the series style before committing to it.</w:t>
+        <w:t>For motion shots, generate the STILL first (Seedream), then animate it with image-to-video so the style is preserved.</w:t>
+      </w:r>
+    </w:p>
+    <w:p>
+      <w:pPr>
+        <w:pStyle w:val="ListBullet"/>
+      </w:pPr>
+      <w:r>
+        <w:rPr>
+          <w:sz w:val="21"/>
+        </w:rPr>
+        <w:t>COST NOTE: the Seedream ‘365-day Unlimited’ benefit is advertised for the Higgsfield WEB APP — generating there avoids burning credits. Via API/automation Seedream still bills ~1 credit/image, so for daily volume either do the bulk in the web app or budget credits. The FREE tier (~10 credits/day) cannot sustain a full episode.</w:t>
       </w:r>
     </w:p>
     <w:p>
@@ -2750,7 +2761,7 @@
         <w:rPr>
           <w:sz w:val="21"/>
         </w:rPr>
-        <w:t>Cost guide (Nano Banana Pro ≈ 2 credits/image): generating EVERY frame ≈ 300–600 credits/episode; the key-frame + edit approach ≈ 120–240 credits/episode.</w:t>
+        <w:t>Cost guide: Seedream 4.5 ≈ 1 credit/image via API (or UNLIMITED in the web app on a paid plan); Nano Banana Pro ≈ 2 credits/image. Generating every frame on Seedream via API ≈ 150–300 credits/episode; the key-frame + edit approach roughly halves that. Using the web app’s unlimited Seedream removes the credit ceiling for stills entirely.</w:t>
       </w:r>
     </w:p>
     <w:p>
@@ -2931,7 +2942,7 @@
         <w:rPr>
           <w:sz w:val="21"/>
         </w:rPr>
-        <w:t>Generate every image on Higgsfield’s best model at 16:9, reusing the Host Element/Soul and style key frame.</w:t>
+        <w:t>Generate every image on Seedream 4.5 (primary) at 16:9, reusing the Host Element and style key frame; use Nano Banana Pro only for text/diagram frames.</w:t>
       </w:r>
     </w:p>
     <w:p>

</xml_diff>

<commit_message>
Add Higgsfield Prompt Pack as a deliverable in the production guide
After the shot list, Claude now also outputs a paste-ready Prompt Pack: a
fixed Consistency Header (style suffix + character/world bible + settings)
plus one thorough per-shot prompt that restates recurring characters
verbatim so all episode images generate consistently. Update deliverables
(now three: shot list, prompt pack, image folder), folder naming, procedure,
and checklists accordingly.

https://claude.ai/code/session_012yrhJkQFRZkiQjmevywnos
</commit_message>
<xml_diff>
--- a/PRODUCTION_GUIDE.docx
+++ b/PRODUCTION_GUIDE.docx
@@ -160,7 +160,7 @@
         <w:pStyle w:val="Heading1"/>
       </w:pPr>
       <w:r>
-        <w:t>2. The Output: Two Deliverables, Every Time</w:t>
+        <w:t>2. The Output: Three Deliverables, Every Time</w:t>
       </w:r>
     </w:p>
     <w:p>
@@ -169,7 +169,7 @@
           <w:i w:val="0"/>
           <w:sz w:val="21"/>
         </w:rPr>
-        <w:t>For each row called, Claude produces exactly two things:</w:t>
+        <w:t>For each row called, Claude produces three things:</w:t>
       </w:r>
     </w:p>
     <w:p>
@@ -180,7 +180,7 @@
         <w:rPr>
           <w:sz w:val="21"/>
         </w:rPr>
-        <w:t>DELIVERABLE A — THE SHOT LIST (a Word document). A reader-ready narration script broken into shots, each with a timestamp range and the exact image to be shown during that stretch of script. Visuals change every 3–5 seconds.</w:t>
+        <w:t>DELIVERABLE A — THE SHOT LIST (a Word document). A reader-ready narration script broken into shots, each with a timestamp range and the exact image to be shown during that stretch of script. Visuals change every 3–5 seconds. (Spec: Part 3.)</w:t>
       </w:r>
     </w:p>
     <w:p>
@@ -191,7 +191,18 @@
         <w:rPr>
           <w:sz w:val="21"/>
         </w:rPr>
-        <w:t>DELIVERABLE B — THE IMAGE FOLDER. A folder containing every image referenced in the shot list, generated with Higgsfield’s best image model in the fixed series style, named to match the shots.</w:t>
+        <w:t>DELIVERABLE B — THE HIGGSFIELD PROMPT PACK. A single, paste-ready set of prompts that generates EVERY image for the episode in the fixed style, written with thorough, repeated descriptions so the whole set stays consistent. The user pastes these into the Higgsfield web app (Seedream 4.5) to generate the images for free. (Spec: Part 8f.)</w:t>
+      </w:r>
+    </w:p>
+    <w:p>
+      <w:pPr>
+        <w:pStyle w:val="ListNumber"/>
+      </w:pPr>
+      <w:r>
+        <w:rPr>
+          <w:sz w:val="21"/>
+        </w:rPr>
+        <w:t>DELIVERABLE C — THE IMAGE FOLDER. The actual images, produced by running the Prompt Pack — generated free in the Higgsfield web app, or via API at credit cost — named to match the shots. (Spec: Part 9.)</w:t>
       </w:r>
     </w:p>
     <w:p>
@@ -200,7 +211,7 @@
           <w:i w:val="0"/>
           <w:sz w:val="21"/>
         </w:rPr>
-        <w:t>The shot list and the folder are linked one-to-one: shot_001 in the document corresponds to shot_001.png in the folder. (See Part 9 for naming.)</w:t>
+        <w:t>All three are linked one-to-one: Shot 001 in the document ↔ Prompt 001 in the Pack ↔ shot_001.png in the folder.</w:t>
       </w:r>
     </w:p>
     <w:p>
@@ -336,7 +347,7 @@
         <w:rPr>
           <w:sz w:val="21"/>
         </w:rPr>
-        <w:t>Higgsfield prompt (the full prompt used to generate this image, INCLUDING the Master Style Suffix).</w:t>
+        <w:t>Prompt # (points to the matching paste-ready prompt in the Prompt Pack, Deliverable B). The FULL prompts live in the Pack — not the shot list — so they stay together and consistent.</w:t>
       </w:r>
     </w:p>
     <w:p>
@@ -2766,6 +2777,226 @@
     </w:p>
     <w:p>
       <w:pPr>
+        <w:pStyle w:val="Heading2"/>
+      </w:pPr>
+      <w:r>
+        <w:t>8f. Deliverable B — The Higgsfield Prompt Pack</w:t>
+      </w:r>
+    </w:p>
+    <w:p>
+      <w:r>
+        <w:rPr>
+          <w:i w:val="0"/>
+          <w:sz w:val="21"/>
+        </w:rPr>
+        <w:t>After the shot list is built, ALWAYS output a PROMPT PACK: the exact, paste-ready prompts the user runs in the Higgsfield web app (Seedream 4.5) to generate the whole episode's images consistently. It has two parts.</w:t>
+      </w:r>
+    </w:p>
+    <w:p>
+      <w:r>
+        <w:rPr>
+          <w:i w:val="0"/>
+          <w:sz w:val="21"/>
+        </w:rPr>
+        <w:t>PART 1 — THE CONSISTENCY HEADER (written once; applies to every image). A fixed block the user keeps attached to every generation, containing:</w:t>
+      </w:r>
+    </w:p>
+    <w:p>
+      <w:pPr>
+        <w:pStyle w:val="ListBullet"/>
+      </w:pPr>
+      <w:r>
+        <w:rPr>
+          <w:sz w:val="21"/>
+        </w:rPr>
+        <w:t>STYLE BLOCK: the full Master Style Suffix (Part 8d), verbatim.</w:t>
+      </w:r>
+    </w:p>
+    <w:p>
+      <w:pPr>
+        <w:pStyle w:val="ListBullet"/>
+      </w:pPr>
+      <w:r>
+        <w:rPr>
+          <w:sz w:val="21"/>
+        </w:rPr>
+        <w:t>CHARACTER BIBLE: a thorough, word-for-word description of every recurring character that must look identical in every shot — the Host (species, exact body color, face, signature accessory), the Animal of the Week (palette re-tint + shape), and the crowd/figure convention. These EXACT words are reused in every prompt that features the character.</w:t>
+      </w:r>
+    </w:p>
+    <w:p>
+      <w:pPr>
+        <w:pStyle w:val="ListBullet"/>
+      </w:pPr>
+      <w:r>
+        <w:rPr>
+          <w:sz w:val="21"/>
+        </w:rPr>
+        <w:t>WORLD / SET BIBLE: the recurring environment(s) (e.g., the cozy study/living room) described identically.</w:t>
+      </w:r>
+    </w:p>
+    <w:p>
+      <w:pPr>
+        <w:pStyle w:val="ListBullet"/>
+      </w:pPr>
+      <w:r>
+        <w:rPr>
+          <w:sz w:val="21"/>
+        </w:rPr>
+        <w:t>PALETTE: the canonical hex list (Part 7b).</w:t>
+      </w:r>
+    </w:p>
+    <w:p>
+      <w:pPr>
+        <w:pStyle w:val="ListBullet"/>
+      </w:pPr>
+      <w:r>
+        <w:rPr>
+          <w:sz w:val="21"/>
+        </w:rPr>
+        <w:t>SETTINGS: Seedream 4.5, 16:9; attach the approved style key-frame as a reference image and the Host Element; reuse ONE seed within each shot family.</w:t>
+      </w:r>
+    </w:p>
+    <w:p>
+      <w:r>
+        <w:rPr>
+          <w:i w:val="0"/>
+          <w:sz w:val="21"/>
+        </w:rPr>
+        <w:t>PART 2 — THE PER-SHOT PROMPTS (one per image, numbered to match the shot list). Each prompt = the Consistency Header content + the shot-specific [shot type] + [subject &amp; action] + [setting] + [coral accent]. Each per-shot prompt MUST:</w:t>
+      </w:r>
+    </w:p>
+    <w:p>
+      <w:pPr>
+        <w:pStyle w:val="ListBullet"/>
+      </w:pPr>
+      <w:r>
+        <w:rPr>
+          <w:sz w:val="21"/>
+        </w:rPr>
+        <w:t>Re-state the recurring characters using the SAME wording as the Character Bible — never paraphrase and never write 'same as before'; paraphrasing is what causes drift.</w:t>
+      </w:r>
+    </w:p>
+    <w:p>
+      <w:pPr>
+        <w:pStyle w:val="ListBullet"/>
+      </w:pPr>
+      <w:r>
+        <w:rPr>
+          <w:sz w:val="21"/>
+        </w:rPr>
+        <w:t>Name the ONE thing that changes from the previous shot, so consecutive frames interconnect.</w:t>
+      </w:r>
+    </w:p>
+    <w:p>
+      <w:pPr>
+        <w:pStyle w:val="ListBullet"/>
+      </w:pPr>
+      <w:r>
+        <w:rPr>
+          <w:sz w:val="21"/>
+        </w:rPr>
+        <w:t>State its seed and shot-family group.</w:t>
+      </w:r>
+    </w:p>
+    <w:p>
+      <w:pPr>
+        <w:pStyle w:val="ListBullet"/>
+      </w:pPr>
+      <w:r>
+        <w:rPr>
+          <w:sz w:val="21"/>
+        </w:rPr>
+        <w:t>Be fully self-contained and paste-ready, so it still works if pasted on its own.</w:t>
+      </w:r>
+    </w:p>
+    <w:tbl>
+      <w:tblPr>
+        <w:tblStyle w:val="TableGrid"/>
+        <w:tblW w:type="auto" w:w="0"/>
+        <w:tblLook w:firstColumn="1" w:firstRow="1" w:lastColumn="0" w:lastRow="0" w:noHBand="0" w:noVBand="1" w:val="04A0"/>
+      </w:tblPr>
+      <w:tblGrid>
+        <w:gridCol w:w="8640"/>
+      </w:tblGrid>
+      <w:tr>
+        <w:tc>
+          <w:tcPr>
+            <w:tcW w:type="dxa" w:w="8640"/>
+            <w:shd w:val="clear" w:color="auto" w:fill="FBEFD6"/>
+          </w:tcPr>
+          <w:p>
+            <w:r/>
+            <w:r>
+              <w:rPr>
+                <w:b/>
+                <w:color w:val="8A4B16"/>
+                <w:sz w:val="20"/>
+              </w:rPr>
+              <w:t>THOROUGHNESS RULE: every per-shot prompt must carry a COMPLETE description of the characters, palette, and style. Repeating the full description in all 150–300 prompts is exactly what keeps the separately generated images consistent across the whole episode.</w:t>
+            </w:r>
+          </w:p>
+        </w:tc>
+      </w:tr>
+    </w:tbl>
+    <w:p/>
+    <w:p>
+      <w:r>
+        <w:rPr>
+          <w:b/>
+          <w:color w:val="1F4E5F"/>
+          <w:sz w:val="19"/>
+        </w:rPr>
+        <w:t>PROMPT PACK — EXAMPLE (condensed):</w:t>
+      </w:r>
+    </w:p>
+    <w:tbl>
+      <w:tblPr>
+        <w:tblStyle w:val="TableGrid"/>
+        <w:tblW w:type="auto" w:w="0"/>
+        <w:tblLook w:firstColumn="1" w:firstRow="1" w:lastColumn="0" w:lastRow="0" w:noHBand="0" w:noVBand="1" w:val="04A0"/>
+      </w:tblPr>
+      <w:tblGrid>
+        <w:gridCol w:w="8640"/>
+      </w:tblGrid>
+      <w:tr>
+        <w:tc>
+          <w:tcPr>
+            <w:tcW w:type="dxa" w:w="8640"/>
+            <w:shd w:val="clear" w:color="auto" w:fill="F2F4F0"/>
+          </w:tcPr>
+          <w:p>
+            <w:r/>
+            <w:r>
+              <w:rPr>
+                <w:rFonts w:ascii="Consolas" w:hAnsi="Consolas"/>
+                <w:sz w:val="18"/>
+              </w:rPr>
+              <w:t>=== CONSISTENCY HEADER (attach to every image) ===</w:t>
+              <w:br/>
+              <w:t>HOST: a friendly rounded teal-blue fox, small charcoal dot eyes, a signature coral-orange knitted scarf, chunky rounded shapes.</w:t>
+              <w:br/>
+              <w:t>SET: a cozy mid-century living room — pendant lamp, monstera plant, window with stylized autumn trees.</w:t>
+              <w:br/>
+              <w:t>STYLE: [paste full Master Style Suffix].  SETTINGS: Seedream 4.5, 16:9, reference = style key-frame, Element = host-fox, seed per shot-family.</w:t>
+              <w:br/>
+              <w:br/>
+              <w:t>=== SHOT 001 (seed 673346) ===</w:t>
+              <w:br/>
+              <w:t>Medium shot of the teal-blue fox host with charcoal dot eyes and coral knitted scarf, leaning in with a curious expression, in the cozy mid-century living room (pendant lamp, monstera, autumn window). Coral scarf is the focal accent. [full Master Style Suffix]</w:t>
+              <w:br/>
+              <w:br/>
+              <w:t>=== SHOT 002 (seed 673346) ===</w:t>
+              <w:br/>
+              <w:t>Same teal-blue fox host (charcoal dot eyes, coral knitted scarf), same living room; now gesturing toward a small lone teal figure with a thin coral crack opening beneath it. Only the added figure changes from Shot 001. [full Master Style Suffix]</w:t>
+            </w:r>
+          </w:p>
+        </w:tc>
+      </w:tr>
+    </w:tbl>
+    <w:p/>
+    <w:p/>
+    <w:p>
+      <w:pPr>
         <w:pStyle w:val="Heading1"/>
       </w:pPr>
       <w:r>
@@ -2817,7 +3048,9 @@
               <w:br/>
               <w:t xml:space="preserve">    EP07_shot-list.docx          &lt;- Deliverable A (clean script + shot table)</w:t>
               <w:br/>
-              <w:t xml:space="preserve">    images/                      &lt;- Deliverable B</w:t>
+              <w:t xml:space="preserve">    EP07_prompt-pack.txt         &lt;- Deliverable B (consistency header + all per-shot prompts)</w:t>
+              <w:br/>
+              <w:t xml:space="preserve">    images/                      &lt;- Deliverable C (produced by running the Prompt Pack)</w:t>
               <w:br/>
               <w:t xml:space="preserve">        shot_001.png</w:t>
               <w:br/>
@@ -2846,7 +3079,7 @@
         <w:rPr>
           <w:sz w:val="21"/>
         </w:rPr>
-        <w:t>Image filenames MUST match the shot list (shot_001.png ↔ Shot 001). Zero-pad to 3 digits.</w:t>
+        <w:t>Numbers MUST match across all three: Prompt 001 ↔ Shot 001 ↔ shot_001.png. Zero-pad to 3 digits.</w:t>
       </w:r>
     </w:p>
     <w:p>
@@ -2857,7 +3090,7 @@
         <w:rPr>
           <w:sz w:val="21"/>
         </w:rPr>
-        <w:t>One image per shot. Clips go in /clips with the same shot number and are marked CLIP in the table.</w:t>
+        <w:t>One prompt and one image per shot. Clips go in /clips with the same shot number and are marked CLIP.</w:t>
       </w:r>
     </w:p>
     <w:p>
@@ -2920,7 +3153,7 @@
         <w:rPr>
           <w:sz w:val="21"/>
         </w:rPr>
-        <w:t>Build the shot list table: for each shot write the narration slice, a one-line visual, file name, type, and the full Higgsfield prompt (subject + action + setting + Master Style Suffix).</w:t>
+        <w:t>Build the shot list table (Deliverable A): for each shot write the narration slice, a one-line visual, file name, and type.</w:t>
       </w:r>
     </w:p>
     <w:p>
@@ -2942,7 +3175,18 @@
         <w:rPr>
           <w:sz w:val="21"/>
         </w:rPr>
-        <w:t>Generate every image on Seedream 4.5 (primary) at 16:9, reusing the Host Element and style key frame; use Nano Banana Pro only for text/diagram frames.</w:t>
+        <w:t>Build the PROMPT PACK (Deliverable B, Part 8f): a Consistency Header (style suffix + character/world bible + settings) plus one paste-ready prompt per shot, each restating the recurring characters VERBATIM so all images stay consistent.</w:t>
+      </w:r>
+    </w:p>
+    <w:p>
+      <w:pPr>
+        <w:pStyle w:val="ListNumber"/>
+      </w:pPr>
+      <w:r>
+        <w:rPr>
+          <w:sz w:val="21"/>
+        </w:rPr>
+        <w:t>Produce the images (Deliverable C) by running the Prompt Pack — free in the Higgsfield web app on Seedream 4.5 (recommended), or via API at credit cost — at 16:9, reusing the Host Element and style key frame; Nano Banana Pro only for text/diagram frames.</w:t>
       </w:r>
     </w:p>
     <w:p>
@@ -2964,7 +3208,7 @@
         <w:rPr>
           <w:sz w:val="21"/>
         </w:rPr>
-        <w:t>Save Deliverable A (shot-list.docx) and Deliverable B (images/ folder, + clips/ if needed) per Part 9 naming.</w:t>
+        <w:t>Save Deliverable A (shot-list.docx), Deliverable B (prompt-pack.txt), and Deliverable C (images/ folder, + clips/ if any) per Part 9 naming.</w:t>
       </w:r>
     </w:p>
     <w:p>
@@ -3064,6 +3308,46 @@
       </w:pPr>
       <w:r>
         <w:t>☐  File names match the images folder exactly.</w:t>
+      </w:r>
+    </w:p>
+    <w:p>
+      <w:pPr>
+        <w:pStyle w:val="Heading2"/>
+      </w:pPr>
+      <w:r>
+        <w:t>Prompt pack (Deliverable B)</w:t>
+      </w:r>
+    </w:p>
+    <w:p>
+      <w:pPr>
+        <w:pStyle w:val="ListBullet"/>
+      </w:pPr>
+      <w:r>
+        <w:t>☐  A Consistency Header is present: full style suffix + character bible + world/set bible + palette + settings.</w:t>
+      </w:r>
+    </w:p>
+    <w:p>
+      <w:pPr>
+        <w:pStyle w:val="ListBullet"/>
+      </w:pPr>
+      <w:r>
+        <w:t>☐  Every per-shot prompt restates recurring characters VERBATIM (never 'same as above').</w:t>
+      </w:r>
+    </w:p>
+    <w:p>
+      <w:pPr>
+        <w:pStyle w:val="ListBullet"/>
+      </w:pPr>
+      <w:r>
+        <w:t>☐  Each prompt is self-contained, paste-ready, and numbered to match the shot list and image files.</w:t>
+      </w:r>
+    </w:p>
+    <w:p>
+      <w:pPr>
+        <w:pStyle w:val="ListBullet"/>
+      </w:pPr>
+      <w:r>
+        <w:t>☐  Seed / shot-family grouping noted so consecutive frames interconnect.</w:t>
       </w:r>
     </w:p>
     <w:p>
@@ -3122,7 +3406,7 @@
           <w:color w:val="888888"/>
           <w:sz w:val="19"/>
         </w:rPr>
-        <w:t>End of guide. Inputs: finance_animal_behavior_matches.xlsx. Outputs per row: one shot-list .docx and one image folder, in the fixed series style, with visuals changing every 3–5 seconds.</w:t>
+        <w:t>End of guide. Inputs: finance_animal_behavior_matches.xlsx. Outputs per row: a shot-list .docx, a Higgsfield prompt pack, and an image folder, in the fixed series style, with visuals changing every 3–5 seconds.</w:t>
       </w:r>
     </w:p>
     <w:sectPr>

</xml_diff>